<commit_message>
Deck: economy-vs-sentiment numbers, own-words reasons, ranked causes, politics, synthesis, backups; report: ranked-causes RQ3 bullet
Co-Authored-By: Claude Opus 5.5 <noreply@anthropic.com>
</commit_message>
<xml_diff>
--- a/report/Consumer_Sentiment_Media_Report.docx
+++ b/report/Consumer_Sentiment_Media_Report.docx
@@ -850,7 +850,7 @@
           <w:i w:val="0"/>
           <w:sz w:val="20"/>
         </w:rPr>
-        <w:t>RQ3.</w:t>
+        <w:t>RQ3 — what causes the mismatch, ranked.</w:t>
       </w:r>
       <w:r>
         <w:rPr>
@@ -858,7 +858,7 @@
           <w:i w:val="0"/>
           <w:sz w:val="20"/>
         </w:rPr>
-        <w:t xml:space="preserve"> U-3, inflation and GDP explain ~13% of the 2019→2025–26 fall; household pressures (price level, food, U-6, policy uncertainty) raise this to roughly half; the web-mode change adds ~16%.</w:t>
+        <w:t xml:space="preserve"> U-3, inflation and GDP alone explain ~13% of the fall. Regrouping the household-pressure model by cause (points of the -41.3): cost of living (cumulative price level, food, gasoline, inflation) -11.4; survey-mode change -6.6; policy uncertainty (tariffs, shutdown) -6.1; jobs, income, growth and mortgage rates -2.5; partisan composition -2.4; unexplained -12.4. Respondents say the same in their own words: 'worse off because of higher prices' rose from 7% (2019) to 45% — above the 2022 peak (40%) — and 'bad time to buy a home: interest rates' from 8% to 44%. The 2026 gap is larger for current conditions (-43.7) than expectations (-25.8): the grievance is about the present cost of living, not fear of recession.</w:t>
       </w:r>
     </w:p>
     <w:p>

</xml_diff>

<commit_message>
Report: tidy Table 9 model labels
Co-Authored-By: Claude Opus 5.5 <noreply@anthropic.com>
</commit_message>
<xml_diff>
--- a/report/Consumer_Sentiment_Media_Report.docx
+++ b/report/Consumer_Sentiment_Media_Report.docx
@@ -10393,7 +10393,7 @@
               <w:rPr>
                 <w:sz w:val="16"/>
               </w:rPr>
-              <w:t>M1 econ only</w:t>
+              <w:t>M1 econ</w:t>
             </w:r>
           </w:p>
         </w:tc>
@@ -10539,7 +10539,7 @@
               <w:rPr>
                 <w:sz w:val="16"/>
               </w:rPr>
-              <w:t>M2 + media</w:t>
+              <w:t>M2 +media</w:t>
             </w:r>
           </w:p>
         </w:tc>
@@ -10611,7 +10611,7 @@
               <w:rPr>
                 <w:sz w:val="16"/>
               </w:rPr>
-              <w:t>M1 econ only</w:t>
+              <w:t>M1 econ</w:t>
             </w:r>
           </w:p>
         </w:tc>
@@ -10685,7 +10685,7 @@
               <w:rPr>
                 <w:sz w:val="16"/>
               </w:rPr>
-              <w:t>M3 + media + controls</w:t>
+              <w:t>M3 full</w:t>
             </w:r>
           </w:p>
         </w:tc>
@@ -10757,7 +10757,7 @@
               <w:rPr>
                 <w:sz w:val="16"/>
               </w:rPr>
-              <w:t>M3b econ + controls (no media)</w:t>
+              <w:t>M3b no-media</w:t>
             </w:r>
           </w:p>
         </w:tc>
@@ -10831,7 +10831,7 @@
               <w:rPr>
                 <w:sz w:val="16"/>
               </w:rPr>
-              <w:t>M3b econ + controls (no media)</w:t>
+              <w:t>M3b no-media</w:t>
             </w:r>
           </w:p>
         </w:tc>
@@ -10903,7 +10903,7 @@
               <w:rPr>
                 <w:sz w:val="16"/>
               </w:rPr>
-              <w:t>M1 econ only</w:t>
+              <w:t>M1 econ</w:t>
             </w:r>
           </w:p>
         </w:tc>
@@ -10977,7 +10977,7 @@
               <w:rPr>
                 <w:sz w:val="16"/>
               </w:rPr>
-              <w:t>M1 econ only</w:t>
+              <w:t>M1 econ</w:t>
             </w:r>
           </w:p>
         </w:tc>
@@ -11123,7 +11123,7 @@
               <w:rPr>
                 <w:sz w:val="16"/>
               </w:rPr>
-              <w:t>M2 + media</w:t>
+              <w:t>M2 +media</w:t>
             </w:r>
           </w:p>
         </w:tc>
@@ -11195,7 +11195,7 @@
               <w:rPr>
                 <w:sz w:val="16"/>
               </w:rPr>
-              <w:t>M1 econ only</w:t>
+              <w:t>M1 econ</w:t>
             </w:r>
           </w:p>
         </w:tc>
@@ -11269,7 +11269,7 @@
               <w:rPr>
                 <w:sz w:val="16"/>
               </w:rPr>
-              <w:t>M3 + media + controls</w:t>
+              <w:t>M3 full</w:t>
             </w:r>
           </w:p>
         </w:tc>
@@ -11341,7 +11341,7 @@
               <w:rPr>
                 <w:sz w:val="16"/>
               </w:rPr>
-              <w:t>M3b econ + controls (no media)</w:t>
+              <w:t>M3b no-media</w:t>
             </w:r>
           </w:p>
         </w:tc>
@@ -11415,7 +11415,7 @@
               <w:rPr>
                 <w:sz w:val="16"/>
               </w:rPr>
-              <w:t>M3b econ + controls (no media)</w:t>
+              <w:t>M3b no-media</w:t>
             </w:r>
           </w:p>
         </w:tc>
@@ -11487,7 +11487,7 @@
               <w:rPr>
                 <w:sz w:val="16"/>
               </w:rPr>
-              <w:t>M1 econ only</w:t>
+              <w:t>M1 econ</w:t>
             </w:r>
           </w:p>
         </w:tc>

</xml_diff>